<commit_message>
Update application materials with new CV and refresh .DS_Store file
</commit_message>
<xml_diff>
--- a/applications/2026-02-09_Canva_SeniorMLEngineer_VisualSuite/AshkanShokriCV.docx
+++ b/applications/2026-02-09_Canva_SeniorMLEngineer_VisualSuite/AshkanShokriCV.docx
@@ -277,15 +277,7 @@
           <w:bCs/>
           <w:color w:val="000000" w:themeColor="text1"/>
         </w:rPr>
-        <w:t xml:space="preserve"> &amp; Infrastructure</w:t>
-      </w:r>
-      <w:r>
-        <w:rPr>
-          <w:b/>
-          <w:bCs/>
-          <w:color w:val="000000" w:themeColor="text1"/>
-        </w:rPr>
-        <w:t>:</w:t>
+        <w:t xml:space="preserve"> &amp; Infrastructure:</w:t>
       </w:r>
       <w:r>
         <w:rPr>
@@ -401,10 +393,7 @@
         <w:pStyle w:val="expitem"/>
       </w:pPr>
       <w:r>
-        <w:t>Separately, engineered a scalable batch pipeline on Azure that processed over 2 million simulations, supporting a study published i</w:t>
-      </w:r>
-      <w:r>
-        <w:t>n Nature Sustainability.</w:t>
+        <w:t>Separately, engineered a scalable batch pipeline on Azure that processed over 2 million simulations, supporting a study published in Nature Sustainability.</w:t>
       </w:r>
     </w:p>
     <w:p>
@@ -600,13 +589,7 @@
         <w:rPr>
           <w:color w:val="000000" w:themeColor="text1"/>
         </w:rPr>
-        <w:t>:</w:t>
-      </w:r>
-      <w:r>
-        <w:rPr>
-          <w:color w:val="000000" w:themeColor="text1"/>
-        </w:rPr>
-        <w:t xml:space="preserve"> </w:t>
+        <w:t xml:space="preserve">: </w:t>
       </w:r>
       <w:r>
         <w:t xml:space="preserve">Full-stack web app (Next.js, Python, PostgreSQL, </w:t>

</xml_diff>